<commit_message>
Codex: translate mechanics to lore; remove skill-tree gating
This is an in-world tome, so strip the table-mechanics that bled in: no dice
or "proof-roll against Guile", no HP/rounds, no Standard/Advantage. Brew grades
are now craft-lore (sound / potent / exceptional / fouled by skill and fortune)
with qualitative effects. And remove the Novice->Master skill ladder that gated
ingredient counts -- alchemy is gated by player KNOWLEDGE (like Alfonso's
enchantment) and the mathematics of the Third Law, not a purchased skill tree
("The Only Gate Is Knowing... no other ladder"). Regenerated from _build_codex.py.

Co-Authored-By: Claude Opus 4.8 <noreply@anthropic.com>
</commit_message>
<xml_diff>
--- a/Lore Books/The Keeper's Codex of the Last Redoubt.docx
+++ b/Lore Books/The Keeper's Codex of the Last Redoubt.docx
@@ -401,7 +401,7 @@
       <w:tr>
         <w:tc>
           <w:tcPr>
-            <w:tcW w:type="dxa" w:w="2448"/>
+            <w:tcW w:type="dxa" w:w="3744"/>
             <w:shd w:val="clear" w:color="auto" w:fill="E7E3DB"/>
             <w:tcBorders>
               <w:top w:val="single" w:sz="4" w:space="0" w:color="B7A98C"/>
@@ -423,13 +423,13 @@
                 <w:color w:val="6B0F1A"/>
                 <w:sz w:val="19"/>
               </w:rPr>
-              <w:t>The Tasting</w:t>
+              <w:t>The taster</w:t>
             </w:r>
           </w:p>
         </w:tc>
         <w:tc>
           <w:tcPr>
-            <w:tcW w:type="dxa" w:w="6912"/>
+            <w:tcW w:type="dxa" w:w="5616"/>
             <w:shd w:val="clear" w:color="auto" w:fill="E7E3DB"/>
             <w:tcBorders>
               <w:top w:val="single" w:sz="4" w:space="0" w:color="B7A98C"/>
@@ -451,7 +451,7 @@
                 <w:color w:val="6B0F1A"/>
                 <w:sz w:val="19"/>
               </w:rPr>
-              <w:t>What a hand learns</w:t>
+              <w:t>What the tasting reveals</w:t>
             </w:r>
           </w:p>
         </w:tc>
@@ -459,7 +459,7 @@
       <w:tr>
         <w:tc>
           <w:tcPr>
-            <w:tcW w:type="dxa" w:w="2448"/>
+            <w:tcW w:type="dxa" w:w="3744"/>
             <w:tcBorders>
               <w:top w:val="single" w:sz="4" w:space="0" w:color="B7A98C"/>
               <w:bottom w:val="single" w:sz="4" w:space="0" w:color="B7A98C"/>
@@ -480,13 +480,13 @@
                 <w:color w:val="1C1C1C"/>
                 <w:sz w:val="19"/>
               </w:rPr>
-              <w:t>Any hand</w:t>
+              <w:t>A beginner</w:t>
             </w:r>
           </w:p>
         </w:tc>
         <w:tc>
           <w:tcPr>
-            <w:tcW w:type="dxa" w:w="6912"/>
+            <w:tcW w:type="dxa" w:w="5616"/>
             <w:tcBorders>
               <w:top w:val="single" w:sz="4" w:space="0" w:color="B7A98C"/>
               <w:bottom w:val="single" w:sz="4" w:space="0" w:color="B7A98C"/>
@@ -507,7 +507,7 @@
                 <w:color w:val="1C1C1C"/>
                 <w:sz w:val="19"/>
               </w:rPr>
-              <w:t>The primary essence only.</w:t>
+              <w:t>The loudest essence only.</w:t>
             </w:r>
           </w:p>
         </w:tc>
@@ -515,7 +515,7 @@
       <w:tr>
         <w:tc>
           <w:tcPr>
-            <w:tcW w:type="dxa" w:w="2448"/>
+            <w:tcW w:type="dxa" w:w="3744"/>
             <w:tcBorders>
               <w:top w:val="single" w:sz="4" w:space="0" w:color="B7A98C"/>
               <w:bottom w:val="single" w:sz="4" w:space="0" w:color="B7A98C"/>
@@ -536,13 +536,13 @@
                 <w:color w:val="1C1C1C"/>
                 <w:sz w:val="19"/>
               </w:rPr>
-              <w:t>Apprentice</w:t>
+              <w:t>One who has studied the essences</w:t>
             </w:r>
           </w:p>
         </w:tc>
         <w:tc>
           <w:tcPr>
-            <w:tcW w:type="dxa" w:w="6912"/>
+            <w:tcW w:type="dxa" w:w="5616"/>
             <w:tcBorders>
               <w:top w:val="single" w:sz="4" w:space="0" w:color="B7A98C"/>
               <w:bottom w:val="single" w:sz="4" w:space="0" w:color="B7A98C"/>
@@ -563,7 +563,7 @@
                 <w:color w:val="1C1C1C"/>
                 <w:sz w:val="19"/>
               </w:rPr>
-              <w:t>Up to two essences.</w:t>
+              <w:t>Two at once.</w:t>
             </w:r>
           </w:p>
         </w:tc>
@@ -571,7 +571,7 @@
       <w:tr>
         <w:tc>
           <w:tcPr>
-            <w:tcW w:type="dxa" w:w="2448"/>
+            <w:tcW w:type="dxa" w:w="3744"/>
             <w:tcBorders>
               <w:top w:val="single" w:sz="4" w:space="0" w:color="B7A98C"/>
               <w:bottom w:val="single" w:sz="4" w:space="0" w:color="B7A98C"/>
@@ -592,13 +592,13 @@
                 <w:color w:val="1C1C1C"/>
                 <w:sz w:val="19"/>
               </w:rPr>
-              <w:t>Adept and above</w:t>
+              <w:t>One who knows them all</w:t>
             </w:r>
           </w:p>
         </w:tc>
         <w:tc>
           <w:tcPr>
-            <w:tcW w:type="dxa" w:w="6912"/>
+            <w:tcW w:type="dxa" w:w="5616"/>
             <w:tcBorders>
               <w:top w:val="single" w:sz="4" w:space="0" w:color="B7A98C"/>
               <w:bottom w:val="single" w:sz="4" w:space="0" w:color="B7A98C"/>
@@ -625,6 +625,20 @@
         </w:tc>
       </w:tr>
     </w:tbl>
+    <w:p>
+      <w:pPr>
+        <w:spacing w:after="160"/>
+      </w:pPr>
+      <w:r>
+        <w:rPr>
+          <w:rFonts w:ascii="Cambria" w:hAnsi="Cambria"/>
+          <w:i w:val="0"/>
+          <w:color w:val="44403A"/>
+          <w:sz w:val="21"/>
+        </w:rPr>
+        <w:t>The tongue does not improve with rank. The knowing does. A beginner feels only the loudest essence not because some seal is closed to them, but because they have not yet learned to recognize the rest of what they are already feeling.</w:t>
+      </w:r>
+    </w:p>
     <w:p>
       <w:pPr>
         <w:spacing w:after="40"/>
@@ -3440,363 +3454,50 @@
           <w:color w:val="8B1A1A"/>
           <w:sz w:val="26"/>
         </w:rPr>
-        <w:t>The Hand by Degree</w:t>
+        <w:t>The Only Gate Is Knowing</w:t>
       </w:r>
     </w:p>
-    <w:tbl>
-      <w:tblPr>
-        <w:tblW w:type="auto" w:w="0"/>
-        <w:jc w:val="center"/>
-        <w:tblLayout w:type="fixed"/>
-        <w:tblLook w:firstColumn="1" w:firstRow="1" w:lastColumn="0" w:lastRow="0" w:noHBand="0" w:noVBand="1" w:val="04A0"/>
-      </w:tblPr>
-      <w:tblGrid>
-        <w:gridCol w:w="4680"/>
-        <w:gridCol w:w="4680"/>
-      </w:tblGrid>
-      <w:tr>
-        <w:tc>
-          <w:tcPr>
-            <w:tcW w:type="dxa" w:w="1584"/>
-            <w:shd w:val="clear" w:color="auto" w:fill="E7E3DB"/>
-            <w:tcBorders>
-              <w:top w:val="single" w:sz="4" w:space="0" w:color="B7A98C"/>
-              <w:bottom w:val="single" w:sz="4" w:space="0" w:color="B7A98C"/>
-              <w:left w:val="single" w:sz="4" w:space="0" w:color="B7A98C"/>
-              <w:right w:val="single" w:sz="4" w:space="0" w:color="B7A98C"/>
-            </w:tcBorders>
-          </w:tcPr>
-          <w:p>
-            <w:pPr>
-              <w:spacing w:after="40" w:before="40"/>
-            </w:pPr>
-            <w:r/>
-            <w:r>
-              <w:rPr>
-                <w:rFonts w:ascii="Cambria" w:hAnsi="Cambria"/>
-                <w:b/>
-                <w:i w:val="0"/>
-                <w:color w:val="6B0F1A"/>
-                <w:sz w:val="19"/>
-              </w:rPr>
-              <w:t>Degree</w:t>
-            </w:r>
-          </w:p>
-        </w:tc>
-        <w:tc>
-          <w:tcPr>
-            <w:tcW w:type="dxa" w:w="7776"/>
-            <w:shd w:val="clear" w:color="auto" w:fill="E7E3DB"/>
-            <w:tcBorders>
-              <w:top w:val="single" w:sz="4" w:space="0" w:color="B7A98C"/>
-              <w:bottom w:val="single" w:sz="4" w:space="0" w:color="B7A98C"/>
-              <w:left w:val="single" w:sz="4" w:space="0" w:color="B7A98C"/>
-              <w:right w:val="single" w:sz="4" w:space="0" w:color="B7A98C"/>
-            </w:tcBorders>
-          </w:tcPr>
-          <w:p>
-            <w:pPr>
-              <w:spacing w:after="40" w:before="40"/>
-            </w:pPr>
-            <w:r/>
-            <w:r>
-              <w:rPr>
-                <w:rFonts w:ascii="Cambria" w:hAnsi="Cambria"/>
-                <w:b/>
-                <w:i w:val="0"/>
-                <w:color w:val="6B0F1A"/>
-                <w:sz w:val="19"/>
-              </w:rPr>
-              <w:t>What the hand may do</w:t>
-            </w:r>
-          </w:p>
-        </w:tc>
-      </w:tr>
-      <w:tr>
-        <w:tc>
-          <w:tcPr>
-            <w:tcW w:type="dxa" w:w="1584"/>
-            <w:tcBorders>
-              <w:top w:val="single" w:sz="4" w:space="0" w:color="B7A98C"/>
-              <w:bottom w:val="single" w:sz="4" w:space="0" w:color="B7A98C"/>
-              <w:left w:val="single" w:sz="4" w:space="0" w:color="B7A98C"/>
-              <w:right w:val="single" w:sz="4" w:space="0" w:color="B7A98C"/>
-            </w:tcBorders>
-          </w:tcPr>
-          <w:p>
-            <w:pPr>
-              <w:spacing w:after="40" w:before="40"/>
-            </w:pPr>
-            <w:r/>
-            <w:r>
-              <w:rPr>
-                <w:rFonts w:ascii="Cambria" w:hAnsi="Cambria"/>
-                <w:b w:val="0"/>
-                <w:i w:val="0"/>
-                <w:color w:val="1C1C1C"/>
-                <w:sz w:val="19"/>
-              </w:rPr>
-              <w:t>Novice</w:t>
-            </w:r>
-          </w:p>
-        </w:tc>
-        <w:tc>
-          <w:tcPr>
-            <w:tcW w:type="dxa" w:w="7776"/>
-            <w:tcBorders>
-              <w:top w:val="single" w:sz="4" w:space="0" w:color="B7A98C"/>
-              <w:bottom w:val="single" w:sz="4" w:space="0" w:color="B7A98C"/>
-              <w:left w:val="single" w:sz="4" w:space="0" w:color="B7A98C"/>
-              <w:right w:val="single" w:sz="4" w:space="0" w:color="B7A98C"/>
-            </w:tcBorders>
-          </w:tcPr>
-          <w:p>
-            <w:pPr>
-              <w:spacing w:after="40" w:before="40"/>
-            </w:pPr>
-            <w:r/>
-            <w:r>
-              <w:rPr>
-                <w:rFonts w:ascii="Cambria" w:hAnsi="Cambria"/>
-                <w:b w:val="0"/>
-                <w:i w:val="0"/>
-                <w:color w:val="1C1C1C"/>
-                <w:sz w:val="19"/>
-              </w:rPr>
-              <w:t>Tasting reveals the primary only. Brews of one ingredient. Every brew Standard; no proof-roll yet. Keep a written list of essences to hand.</w:t>
-            </w:r>
-          </w:p>
-        </w:tc>
-      </w:tr>
-      <w:tr>
-        <w:tc>
-          <w:tcPr>
-            <w:tcW w:type="dxa" w:w="1584"/>
-            <w:tcBorders>
-              <w:top w:val="single" w:sz="4" w:space="0" w:color="B7A98C"/>
-              <w:bottom w:val="single" w:sz="4" w:space="0" w:color="B7A98C"/>
-              <w:left w:val="single" w:sz="4" w:space="0" w:color="B7A98C"/>
-              <w:right w:val="single" w:sz="4" w:space="0" w:color="B7A98C"/>
-            </w:tcBorders>
-          </w:tcPr>
-          <w:p>
-            <w:pPr>
-              <w:spacing w:after="40" w:before="40"/>
-            </w:pPr>
-            <w:r/>
-            <w:r>
-              <w:rPr>
-                <w:rFonts w:ascii="Cambria" w:hAnsi="Cambria"/>
-                <w:b w:val="0"/>
-                <w:i w:val="0"/>
-                <w:color w:val="1C1C1C"/>
-                <w:sz w:val="19"/>
-              </w:rPr>
-              <w:t>Apprentice</w:t>
-            </w:r>
-          </w:p>
-        </w:tc>
-        <w:tc>
-          <w:tcPr>
-            <w:tcW w:type="dxa" w:w="7776"/>
-            <w:tcBorders>
-              <w:top w:val="single" w:sz="4" w:space="0" w:color="B7A98C"/>
-              <w:bottom w:val="single" w:sz="4" w:space="0" w:color="B7A98C"/>
-              <w:left w:val="single" w:sz="4" w:space="0" w:color="B7A98C"/>
-              <w:right w:val="single" w:sz="4" w:space="0" w:color="B7A98C"/>
-            </w:tcBorders>
-          </w:tcPr>
-          <w:p>
-            <w:pPr>
-              <w:spacing w:after="40" w:before="40"/>
-            </w:pPr>
-            <w:r/>
-            <w:r>
-              <w:rPr>
-                <w:rFonts w:ascii="Cambria" w:hAnsi="Cambria"/>
-                <w:b w:val="0"/>
-                <w:i w:val="0"/>
-                <w:color w:val="1C1C1C"/>
-                <w:sz w:val="19"/>
-              </w:rPr>
-              <w:t>Tasting reveals up to two essences. Brews of two ingredients. May attempt the proof-roll.</w:t>
-            </w:r>
-          </w:p>
-        </w:tc>
-      </w:tr>
-      <w:tr>
-        <w:tc>
-          <w:tcPr>
-            <w:tcW w:type="dxa" w:w="1584"/>
-            <w:tcBorders>
-              <w:top w:val="single" w:sz="4" w:space="0" w:color="B7A98C"/>
-              <w:bottom w:val="single" w:sz="4" w:space="0" w:color="B7A98C"/>
-              <w:left w:val="single" w:sz="4" w:space="0" w:color="B7A98C"/>
-              <w:right w:val="single" w:sz="4" w:space="0" w:color="B7A98C"/>
-            </w:tcBorders>
-          </w:tcPr>
-          <w:p>
-            <w:pPr>
-              <w:spacing w:after="40" w:before="40"/>
-            </w:pPr>
-            <w:r/>
-            <w:r>
-              <w:rPr>
-                <w:rFonts w:ascii="Cambria" w:hAnsi="Cambria"/>
-                <w:b w:val="0"/>
-                <w:i w:val="0"/>
-                <w:color w:val="1C1C1C"/>
-                <w:sz w:val="19"/>
-              </w:rPr>
-              <w:t>Adept</w:t>
-            </w:r>
-          </w:p>
-        </w:tc>
-        <w:tc>
-          <w:tcPr>
-            <w:tcW w:type="dxa" w:w="7776"/>
-            <w:tcBorders>
-              <w:top w:val="single" w:sz="4" w:space="0" w:color="B7A98C"/>
-              <w:bottom w:val="single" w:sz="4" w:space="0" w:color="B7A98C"/>
-              <w:left w:val="single" w:sz="4" w:space="0" w:color="B7A98C"/>
-              <w:right w:val="single" w:sz="4" w:space="0" w:color="B7A98C"/>
-            </w:tcBorders>
-          </w:tcPr>
-          <w:p>
-            <w:pPr>
-              <w:spacing w:after="40" w:before="40"/>
-            </w:pPr>
-            <w:r/>
-            <w:r>
-              <w:rPr>
-                <w:rFonts w:ascii="Cambria" w:hAnsi="Cambria"/>
-                <w:b w:val="0"/>
-                <w:i w:val="0"/>
-                <w:color w:val="1C1C1C"/>
-                <w:sz w:val="19"/>
-              </w:rPr>
-              <w:t>Tasting reveals all essences. Brews of three. May design around an opposed pair on purpose, including a chosen secondary negation. Knows all three Laws whole.</w:t>
-            </w:r>
-          </w:p>
-        </w:tc>
-      </w:tr>
-      <w:tr>
-        <w:tc>
-          <w:tcPr>
-            <w:tcW w:type="dxa" w:w="1584"/>
-            <w:tcBorders>
-              <w:top w:val="single" w:sz="4" w:space="0" w:color="B7A98C"/>
-              <w:bottom w:val="single" w:sz="4" w:space="0" w:color="B7A98C"/>
-              <w:left w:val="single" w:sz="4" w:space="0" w:color="B7A98C"/>
-              <w:right w:val="single" w:sz="4" w:space="0" w:color="B7A98C"/>
-            </w:tcBorders>
-          </w:tcPr>
-          <w:p>
-            <w:pPr>
-              <w:spacing w:after="40" w:before="40"/>
-            </w:pPr>
-            <w:r/>
-            <w:r>
-              <w:rPr>
-                <w:rFonts w:ascii="Cambria" w:hAnsi="Cambria"/>
-                <w:b w:val="0"/>
-                <w:i w:val="0"/>
-                <w:color w:val="1C1C1C"/>
-                <w:sz w:val="19"/>
-              </w:rPr>
-              <w:t>Expert</w:t>
-            </w:r>
-          </w:p>
-        </w:tc>
-        <w:tc>
-          <w:tcPr>
-            <w:tcW w:type="dxa" w:w="7776"/>
-            <w:tcBorders>
-              <w:top w:val="single" w:sz="4" w:space="0" w:color="B7A98C"/>
-              <w:bottom w:val="single" w:sz="4" w:space="0" w:color="B7A98C"/>
-              <w:left w:val="single" w:sz="4" w:space="0" w:color="B7A98C"/>
-              <w:right w:val="single" w:sz="4" w:space="0" w:color="B7A98C"/>
-            </w:tcBorders>
-          </w:tcPr>
-          <w:p>
-            <w:pPr>
-              <w:spacing w:after="40" w:before="40"/>
-            </w:pPr>
-            <w:r/>
-            <w:r>
-              <w:rPr>
-                <w:rFonts w:ascii="Cambria" w:hAnsi="Cambria"/>
-                <w:b w:val="0"/>
-                <w:i w:val="0"/>
-                <w:color w:val="1C1C1C"/>
-                <w:sz w:val="19"/>
-              </w:rPr>
-              <w:t>Brews of four. A successful proof-roll yields Exceptional, not merely Potent. Consult written notes before any brew of three or more.</w:t>
-            </w:r>
-          </w:p>
-        </w:tc>
-      </w:tr>
-      <w:tr>
-        <w:tc>
-          <w:tcPr>
-            <w:tcW w:type="dxa" w:w="1584"/>
-            <w:tcBorders>
-              <w:top w:val="single" w:sz="4" w:space="0" w:color="B7A98C"/>
-              <w:bottom w:val="single" w:sz="4" w:space="0" w:color="B7A98C"/>
-              <w:left w:val="single" w:sz="4" w:space="0" w:color="B7A98C"/>
-              <w:right w:val="single" w:sz="4" w:space="0" w:color="B7A98C"/>
-            </w:tcBorders>
-          </w:tcPr>
-          <w:p>
-            <w:pPr>
-              <w:spacing w:after="40" w:before="40"/>
-            </w:pPr>
-            <w:r/>
-            <w:r>
-              <w:rPr>
-                <w:rFonts w:ascii="Cambria" w:hAnsi="Cambria"/>
-                <w:b w:val="0"/>
-                <w:i w:val="0"/>
-                <w:color w:val="1C1C1C"/>
-                <w:sz w:val="19"/>
-              </w:rPr>
-              <w:t>Master</w:t>
-            </w:r>
-          </w:p>
-        </w:tc>
-        <w:tc>
-          <w:tcPr>
-            <w:tcW w:type="dxa" w:w="7776"/>
-            <w:tcBorders>
-              <w:top w:val="single" w:sz="4" w:space="0" w:color="B7A98C"/>
-              <w:bottom w:val="single" w:sz="4" w:space="0" w:color="B7A98C"/>
-              <w:left w:val="single" w:sz="4" w:space="0" w:color="B7A98C"/>
-              <w:right w:val="single" w:sz="4" w:space="0" w:color="B7A98C"/>
-            </w:tcBorders>
-          </w:tcPr>
-          <w:p>
-            <w:pPr>
-              <w:spacing w:after="40" w:before="40"/>
-            </w:pPr>
-            <w:r/>
-            <w:r>
-              <w:rPr>
-                <w:rFonts w:ascii="Cambria" w:hAnsi="Cambria"/>
-                <w:b w:val="0"/>
-                <w:i w:val="0"/>
-                <w:color w:val="1C1C1C"/>
-                <w:sz w:val="19"/>
-              </w:rPr>
-              <w:t>No ceiling but the mathematics. May reason a new draught from first principle, untested. Consult notes before any brew above three — the mathematics do not forgive mastery.</w:t>
-            </w:r>
-          </w:p>
-        </w:tc>
-      </w:tr>
-    </w:tbl>
     <w:p>
       <w:pPr>
-        <w:spacing w:after="40"/>
+        <w:spacing w:after="160"/>
       </w:pPr>
+      <w:r>
+        <w:rPr>
+          <w:rFonts w:ascii="Cambria" w:hAnsi="Cambria"/>
+          <w:i w:val="0"/>
+          <w:color w:val="1C1C1C"/>
+          <w:sz w:val="22"/>
+        </w:rPr>
+        <w:t>There is no rank in this craft that permits you to brew. No society grants a seal that unlocks the third ingredient, or the fourth. The craft is gated by one thing only: how much of it you have learned.</w:t>
+      </w:r>
+    </w:p>
+    <w:p>
+      <w:pPr>
+        <w:spacing w:after="160"/>
+      </w:pPr>
+      <w:r>
+        <w:rPr>
+          <w:rFonts w:ascii="Cambria" w:hAnsi="Cambria"/>
+          <w:i w:val="0"/>
+          <w:color w:val="1C1C1C"/>
+          <w:sz w:val="22"/>
+        </w:rPr>
+        <w:t>A hand that knows one essence brews with one. A hand that has learned to taste two, and to hold in mind the single pair they make, brews with two. A hand that knows every essence a thing carries, and can hold every pair among three ingredients without losing one, brews with three — and onward, as far as the knowing reaches. The beginner is not forbidden the great workings. They are simply unable to hold one in the head, and a working you cannot hold, you cannot keep from collapsing. The mathematics of the Third Law are the only wall, and they rise for everyone alike.</w:t>
+      </w:r>
+    </w:p>
+    <w:p>
+      <w:pPr>
+        <w:spacing w:after="160"/>
+      </w:pPr>
+      <w:r>
+        <w:rPr>
+          <w:rFonts w:ascii="Cambria" w:hAnsi="Cambria"/>
+          <w:i w:val="0"/>
+          <w:color w:val="1C1C1C"/>
+          <w:sz w:val="22"/>
+        </w:rPr>
+        <w:t>So when this book speaks of a beginner, of one who has studied, of a master, it does not mean a rung you climb or a station you are granted. It means only how much you have come to know. Learn the essences and you may read them; learn the Second Law as a tool and you may set opposed essences against each other on purpose; learn the craft whole and you may reason a draught no one has brewed before. No one hands you the next step. You take it by understanding. That is the whole of advancement, and there is no other ladder.</w:t>
+      </w:r>
     </w:p>
     <w:p>
       <w:pPr>
@@ -3933,7 +3634,7 @@
                 <w:color w:val="1C1C1C"/>
                 <w:sz w:val="19"/>
               </w:rPr>
-              <w:t>The minimum, and enough. Standard quality, reliably, every time, everywhere.</w:t>
+              <w:t>The minimum, and enough. Sound work, reliably, everywhere, every time.</w:t>
             </w:r>
           </w:p>
         </w:tc>
@@ -3989,7 +3690,7 @@
                 <w:color w:val="1C1C1C"/>
                 <w:sz w:val="19"/>
               </w:rPr>
-              <w:t>Begins every brew at Potent before any roll. It pays for itself many times over.</w:t>
+              <w:t>Begins every brew already potent, before the hand has pushed it at all. It pays for itself many times over.</w:t>
             </w:r>
           </w:p>
         </w:tc>
@@ -4045,7 +3746,7 @@
                 <w:color w:val="1C1C1C"/>
                 <w:sz w:val="19"/>
               </w:rPr>
-              <w:t>The proof-roll is made with Advantage — roll twice, take the better.</w:t>
+              <w:t>Steadies the work, so a hand's reach for more from a brew far more often takes hold.</w:t>
             </w:r>
           </w:p>
         </w:tc>
@@ -4101,7 +3802,7 @@
                 <w:color w:val="1C1C1C"/>
                 <w:sz w:val="19"/>
               </w:rPr>
-              <w:t>On a ruined proof-roll, the impurity is caught: the brew is Standard, not Tainted.</w:t>
+              <w:t>Catches the impurity before it sours the draught; a brew that would have fouled comes out merely sound.</w:t>
             </w:r>
           </w:p>
         </w:tc>
@@ -4124,7 +3825,7 @@
           <w:color w:val="8B1A1A"/>
           <w:sz w:val="26"/>
         </w:rPr>
-        <w:t>The Proof of a Brew</w:t>
+        <w:t>On Sound, Potent, and Fouled Brews</w:t>
       </w:r>
     </w:p>
     <w:p>
@@ -4138,7 +3839,7 @@
           <w:color w:val="1C1C1C"/>
           <w:sz w:val="22"/>
         </w:rPr>
-        <w:t>Correct ingredients and correct technique always make a working draught. The proof-roll is the hand's attempt to push it past its baseline — to coax the last of the essence out. It is optional. A Standard draught is a whole draught. Roll against your Guile.</w:t>
+        <w:t>Correct ingredients and correct technique always make a working draught — a sound one, every time, with no fortune asked of you. Past that, the craft rewards cunning. A clever hand, in a good hour, draws a brew out past its plain strength into the potent; and now and then, rarely and worth the remembering, into the exceptional, twice past sound. A careless moment in a delicate brew fouls it instead: it still works, but an essence you did not mean has come through. Do not pour a fouled brew away before you learn what it became. There are discoveries in this craft that were made no other way.</w:t>
       </w:r>
     </w:p>
     <w:tbl>
@@ -4155,7 +3856,7 @@
       <w:tr>
         <w:tc>
           <w:tcPr>
-            <w:tcW w:type="dxa" w:w="3456"/>
+            <w:tcW w:type="dxa" w:w="2160"/>
             <w:shd w:val="clear" w:color="auto" w:fill="E7E3DB"/>
             <w:tcBorders>
               <w:top w:val="single" w:sz="4" w:space="0" w:color="B7A98C"/>
@@ -4177,13 +3878,13 @@
                 <w:color w:val="6B0F1A"/>
                 <w:sz w:val="19"/>
               </w:rPr>
-              <w:t>The roll (against Guile)</w:t>
+              <w:t>The grade</w:t>
             </w:r>
           </w:p>
         </w:tc>
         <w:tc>
           <w:tcPr>
-            <w:tcW w:type="dxa" w:w="5904"/>
+            <w:tcW w:type="dxa" w:w="7200"/>
             <w:shd w:val="clear" w:color="auto" w:fill="E7E3DB"/>
             <w:tcBorders>
               <w:top w:val="single" w:sz="4" w:space="0" w:color="B7A98C"/>
@@ -4205,7 +3906,7 @@
                 <w:color w:val="6B0F1A"/>
                 <w:sz w:val="19"/>
               </w:rPr>
-              <w:t>Result</w:t>
+              <w:t>What it is</w:t>
             </w:r>
           </w:p>
         </w:tc>
@@ -4213,7 +3914,7 @@
       <w:tr>
         <w:tc>
           <w:tcPr>
-            <w:tcW w:type="dxa" w:w="3456"/>
+            <w:tcW w:type="dxa" w:w="2160"/>
             <w:tcBorders>
               <w:top w:val="single" w:sz="4" w:space="0" w:color="B7A98C"/>
               <w:bottom w:val="single" w:sz="4" w:space="0" w:color="B7A98C"/>
@@ -4234,13 +3935,13 @@
                 <w:color w:val="1C1C1C"/>
                 <w:sz w:val="19"/>
               </w:rPr>
-              <w:t>Critical (a 1)</w:t>
+              <w:t>Sound</w:t>
             </w:r>
           </w:p>
         </w:tc>
         <w:tc>
           <w:tcPr>
-            <w:tcW w:type="dxa" w:w="5904"/>
+            <w:tcW w:type="dxa" w:w="7200"/>
             <w:tcBorders>
               <w:top w:val="single" w:sz="4" w:space="0" w:color="B7A98C"/>
               <w:bottom w:val="single" w:sz="4" w:space="0" w:color="B7A98C"/>
@@ -4261,7 +3962,7 @@
                 <w:color w:val="1C1C1C"/>
                 <w:sz w:val="19"/>
               </w:rPr>
-              <w:t>Exceptional — two grades above Standard.</w:t>
+              <w:t>The plain, whole draught — the baseline of correct work.</w:t>
             </w:r>
           </w:p>
         </w:tc>
@@ -4269,7 +3970,7 @@
       <w:tr>
         <w:tc>
           <w:tcPr>
-            <w:tcW w:type="dxa" w:w="3456"/>
+            <w:tcW w:type="dxa" w:w="2160"/>
             <w:tcBorders>
               <w:top w:val="single" w:sz="4" w:space="0" w:color="B7A98C"/>
               <w:bottom w:val="single" w:sz="4" w:space="0" w:color="B7A98C"/>
@@ -4290,13 +3991,13 @@
                 <w:color w:val="1C1C1C"/>
                 <w:sz w:val="19"/>
               </w:rPr>
-              <w:t>Under Guile</w:t>
+              <w:t>Potent</w:t>
             </w:r>
           </w:p>
         </w:tc>
         <w:tc>
           <w:tcPr>
-            <w:tcW w:type="dxa" w:w="5904"/>
+            <w:tcW w:type="dxa" w:w="7200"/>
             <w:tcBorders>
               <w:top w:val="single" w:sz="4" w:space="0" w:color="B7A98C"/>
               <w:bottom w:val="single" w:sz="4" w:space="0" w:color="B7A98C"/>
@@ -4317,7 +4018,7 @@
                 <w:color w:val="1C1C1C"/>
                 <w:sz w:val="19"/>
               </w:rPr>
-              <w:t>Potent — one grade above. (Expert and above: Exceptional.)</w:t>
+              <w:t>Drawn past plain strength by a cunning hand in a good hour.</w:t>
             </w:r>
           </w:p>
         </w:tc>
@@ -4325,7 +4026,7 @@
       <w:tr>
         <w:tc>
           <w:tcPr>
-            <w:tcW w:type="dxa" w:w="3456"/>
+            <w:tcW w:type="dxa" w:w="2160"/>
             <w:tcBorders>
               <w:top w:val="single" w:sz="4" w:space="0" w:color="B7A98C"/>
               <w:bottom w:val="single" w:sz="4" w:space="0" w:color="B7A98C"/>
@@ -4346,13 +4047,13 @@
                 <w:color w:val="1C1C1C"/>
                 <w:sz w:val="19"/>
               </w:rPr>
-              <w:t>Over Guile</w:t>
+              <w:t>Exceptional</w:t>
             </w:r>
           </w:p>
         </w:tc>
         <w:tc>
           <w:tcPr>
-            <w:tcW w:type="dxa" w:w="5904"/>
+            <w:tcW w:type="dxa" w:w="7200"/>
             <w:tcBorders>
               <w:top w:val="single" w:sz="4" w:space="0" w:color="B7A98C"/>
               <w:bottom w:val="single" w:sz="4" w:space="0" w:color="B7A98C"/>
@@ -4373,7 +4074,7 @@
                 <w:color w:val="1C1C1C"/>
                 <w:sz w:val="19"/>
               </w:rPr>
-              <w:t>Standard — no gain. The ingredients are not wasted.</w:t>
+              <w:t>Twice past sound. Rare. The mark of a master, or a fortunate one.</w:t>
             </w:r>
           </w:p>
         </w:tc>
@@ -4381,7 +4082,7 @@
       <w:tr>
         <w:tc>
           <w:tcPr>
-            <w:tcW w:type="dxa" w:w="3456"/>
+            <w:tcW w:type="dxa" w:w="2160"/>
             <w:tcBorders>
               <w:top w:val="single" w:sz="4" w:space="0" w:color="B7A98C"/>
               <w:bottom w:val="single" w:sz="4" w:space="0" w:color="B7A98C"/>
@@ -4402,13 +4103,13 @@
                 <w:color w:val="1C1C1C"/>
                 <w:sz w:val="19"/>
               </w:rPr>
-              <w:t>Critical fail (a 20)</w:t>
+              <w:t>Fouled</w:t>
             </w:r>
           </w:p>
         </w:tc>
         <w:tc>
           <w:tcPr>
-            <w:tcW w:type="dxa" w:w="5904"/>
+            <w:tcW w:type="dxa" w:w="7200"/>
             <w:tcBorders>
               <w:top w:val="single" w:sz="4" w:space="0" w:color="B7A98C"/>
               <w:bottom w:val="single" w:sz="4" w:space="0" w:color="B7A98C"/>
@@ -4429,7 +4130,7 @@
                 <w:color w:val="1C1C1C"/>
                 <w:sz w:val="19"/>
               </w:rPr>
-              <w:t>Tainted — it works, but an unmeant secondary essence has bled through. The cunning Keeper bottles it and learns what it does.</w:t>
+              <w:t>It works, but an unmeant essence has bled through. Bottle it and learn it.</w:t>
             </w:r>
           </w:p>
         </w:tc>
@@ -4553,7 +4254,7 @@
           <w:color w:val="1C1C1C"/>
           <w:sz w:val="22"/>
         </w:rPr>
-        <w:t>Five — Prove it, if you choose. Roll against Guile.</w:t>
+        <w:t>Five — and if the hour is good and the hand cunning, it comes out stronger than plain.</w:t>
       </w:r>
     </w:p>
     <w:tbl>
@@ -4570,7 +4271,7 @@
       <w:tr>
         <w:tc>
           <w:tcPr>
-            <w:tcW w:type="dxa" w:w="3600"/>
+            <w:tcW w:type="dxa" w:w="3168"/>
             <w:shd w:val="clear" w:color="auto" w:fill="E7E3DB"/>
             <w:tcBorders>
               <w:top w:val="single" w:sz="4" w:space="0" w:color="B7A98C"/>
@@ -4598,7 +4299,7 @@
         </w:tc>
         <w:tc>
           <w:tcPr>
-            <w:tcW w:type="dxa" w:w="5760"/>
+            <w:tcW w:type="dxa" w:w="6192"/>
             <w:shd w:val="clear" w:color="auto" w:fill="E7E3DB"/>
             <w:tcBorders>
               <w:top w:val="single" w:sz="4" w:space="0" w:color="B7A98C"/>
@@ -4620,7 +4321,7 @@
                 <w:color w:val="6B0F1A"/>
                 <w:sz w:val="19"/>
               </w:rPr>
-              <w:t>Effect</w:t>
+              <w:t>What it does</w:t>
             </w:r>
           </w:p>
         </w:tc>
@@ -4628,7 +4329,7 @@
       <w:tr>
         <w:tc>
           <w:tcPr>
-            <w:tcW w:type="dxa" w:w="3600"/>
+            <w:tcW w:type="dxa" w:w="3168"/>
             <w:tcBorders>
               <w:top w:val="single" w:sz="4" w:space="0" w:color="B7A98C"/>
               <w:bottom w:val="single" w:sz="4" w:space="0" w:color="B7A98C"/>
@@ -4649,13 +4350,13 @@
                 <w:color w:val="1C1C1C"/>
                 <w:sz w:val="19"/>
               </w:rPr>
-              <w:t>Standard</w:t>
+              <w:t>Sound</w:t>
             </w:r>
           </w:p>
         </w:tc>
         <w:tc>
           <w:tcPr>
-            <w:tcW w:type="dxa" w:w="5760"/>
+            <w:tcW w:type="dxa" w:w="6192"/>
             <w:tcBorders>
               <w:top w:val="single" w:sz="4" w:space="0" w:color="B7A98C"/>
               <w:bottom w:val="single" w:sz="4" w:space="0" w:color="B7A98C"/>
@@ -4676,7 +4377,7 @@
                 <w:color w:val="1C1C1C"/>
                 <w:sz w:val="19"/>
               </w:rPr>
-              <w:t>4 points of harm over four rounds.</w:t>
+              <w:t>Sickens a grown man for a day; worse, if he is small or already weak.</w:t>
             </w:r>
           </w:p>
         </w:tc>
@@ -4684,7 +4385,7 @@
       <w:tr>
         <w:tc>
           <w:tcPr>
-            <w:tcW w:type="dxa" w:w="3600"/>
+            <w:tcW w:type="dxa" w:w="3168"/>
             <w:tcBorders>
               <w:top w:val="single" w:sz="4" w:space="0" w:color="B7A98C"/>
               <w:bottom w:val="single" w:sz="4" w:space="0" w:color="B7A98C"/>
@@ -4705,13 +4406,13 @@
                 <w:color w:val="1C1C1C"/>
                 <w:sz w:val="19"/>
               </w:rPr>
-              <w:t>Potent (under Guile)</w:t>
+              <w:t>Potent</w:t>
             </w:r>
           </w:p>
         </w:tc>
         <w:tc>
           <w:tcPr>
-            <w:tcW w:type="dxa" w:w="5760"/>
+            <w:tcW w:type="dxa" w:w="6192"/>
             <w:tcBorders>
               <w:top w:val="single" w:sz="4" w:space="0" w:color="B7A98C"/>
               <w:bottom w:val="single" w:sz="4" w:space="0" w:color="B7A98C"/>
@@ -4732,7 +4433,7 @@
                 <w:color w:val="1C1C1C"/>
                 <w:sz w:val="19"/>
               </w:rPr>
-              <w:t>8 over four rounds.</w:t>
+              <w:t>Kills the small and the weak outright, and lays a strong man abed.</w:t>
             </w:r>
           </w:p>
         </w:tc>
@@ -4740,7 +4441,7 @@
       <w:tr>
         <w:tc>
           <w:tcPr>
-            <w:tcW w:type="dxa" w:w="3600"/>
+            <w:tcW w:type="dxa" w:w="3168"/>
             <w:tcBorders>
               <w:top w:val="single" w:sz="4" w:space="0" w:color="B7A98C"/>
               <w:bottom w:val="single" w:sz="4" w:space="0" w:color="B7A98C"/>
@@ -4761,13 +4462,13 @@
                 <w:color w:val="1C1C1C"/>
                 <w:sz w:val="19"/>
               </w:rPr>
-              <w:t>Exceptional (a 1, or Expert+ success)</w:t>
+              <w:t>Exceptional</w:t>
             </w:r>
           </w:p>
         </w:tc>
         <w:tc>
           <w:tcPr>
-            <w:tcW w:type="dxa" w:w="5760"/>
+            <w:tcW w:type="dxa" w:w="6192"/>
             <w:tcBorders>
               <w:top w:val="single" w:sz="4" w:space="0" w:color="B7A98C"/>
               <w:bottom w:val="single" w:sz="4" w:space="0" w:color="B7A98C"/>
@@ -4788,7 +4489,7 @@
                 <w:color w:val="1C1C1C"/>
                 <w:sz w:val="19"/>
               </w:rPr>
-              <w:t>12 over four rounds.</w:t>
+              <w:t>Kills a grown man where he stands.</w:t>
             </w:r>
           </w:p>
         </w:tc>
@@ -4796,7 +4497,7 @@
       <w:tr>
         <w:tc>
           <w:tcPr>
-            <w:tcW w:type="dxa" w:w="3600"/>
+            <w:tcW w:type="dxa" w:w="3168"/>
             <w:tcBorders>
               <w:top w:val="single" w:sz="4" w:space="0" w:color="B7A98C"/>
               <w:bottom w:val="single" w:sz="4" w:space="0" w:color="B7A98C"/>
@@ -4817,13 +4518,13 @@
                 <w:color w:val="1C1C1C"/>
                 <w:sz w:val="19"/>
               </w:rPr>
-              <w:t>Tainted (a 20)</w:t>
+              <w:t>Fouled</w:t>
             </w:r>
           </w:p>
         </w:tc>
         <w:tc>
           <w:tcPr>
-            <w:tcW w:type="dxa" w:w="5760"/>
+            <w:tcW w:type="dxa" w:w="6192"/>
             <w:tcBorders>
               <w:top w:val="single" w:sz="4" w:space="0" w:color="B7A98C"/>
               <w:bottom w:val="single" w:sz="4" w:space="0" w:color="B7A98C"/>
@@ -4844,7 +4545,7 @@
                 <w:color w:val="1C1C1C"/>
                 <w:sz w:val="19"/>
               </w:rPr>
-              <w:t>4 over four rounds, and a faint second effect from the ingredients — a numbness, a chill — unmeant, and worth noting.</w:t>
+              <w:t>Does its work, and leaves an odd second mark besides — a numbness, a chill — unmeant, and worth the noting.</w:t>
             </w:r>
           </w:p>
         </w:tc>

</xml_diff>

<commit_message>
Fix Alfonso framing: Peryite's chosen, not a "Peryite carrier"
Peryite is a Daedra, not an extractable disease. Stop framing Alfonso as a
"carrier"/"bioweapons platform" with a "divine frequency" Antoine can isolate
and replicate. Reframe the live runsheet (god-note, trap note, confession +
its GM note, Strain 2.0 missing-piece) and the Codex marginalia: Alfonso is
Peryite's CHOSEN; Antoine covets the living quality of his actual plagues and
goes to harvest the living strain from the infected Ulag, believing (his
arrogance) he can graft its life onto Strain 2.0. Record the hard rule in
AI_README (II.8). Codex regenerated.

Co-Authored-By: Claude Opus 4.8 <noreply@anthropic.com>
</commit_message>
<xml_diff>
--- a/Lore Books/The Keeper's Codex of the Last Redoubt.docx
+++ b/Lore Books/The Keeper's Codex of the Last Redoubt.docx
@@ -4738,7 +4738,7 @@
                 <w:color w:val="44403A"/>
                 <w:sz w:val="21"/>
               </w:rPr>
-              <w:t>Should the work ever find a true carrier — one who hears his god in his own blood, whose plague is told to him and not reasoned out — he is the richest subject the craft will ever open. Do not waste him on a small working. Take everything. We may not get a second.</w:t>
+              <w:t>Should the work ever find one of a god's chosen — one who hears his god in his own blood, whose plague is told to him and not reasoned out — he is the richest subject the craft will ever open. Do not waste him on a small working. Take everything. We may not get a second.</w:t>
             </w:r>
           </w:p>
         </w:tc>
@@ -5413,7 +5413,7 @@
                 <w:color w:val="44403A"/>
                 <w:sz w:val="21"/>
               </w:rPr>
-              <w:t>The First believed every word of this. Forty generations have kept his fire and not one of us has heard the god he kept it for. I have read every page a hundred times. The craft is true. The recipes are true. The Stay has saved lives. The faith is the only part that was ever a lie, and it is the part he believed the most. I keep the fire because the work is real, and the work is the only thing that is.  — the carrier will hear it. I never have.</w:t>
+              <w:t>The First believed every word of this. Forty generations have kept his fire and not one of us has heard the god he kept it for. I have read every page a hundred times. The craft is true. The recipes are true. The Stay has saved lives. The faith is the only part that was ever a lie, and it is the part he believed the most. I keep the fire because the work is real, and the work is the only thing that is.  — the chosen hear their god. I never have.</w:t>
             </w:r>
           </w:p>
         </w:tc>

</xml_diff>